<commit_message>
Add official patent documents (Form 1, Form 2, Drawings) and model weights
</commit_message>
<xml_diff>
--- a/Form2_Provisional_Specification_Updated.docx
+++ b/Form2_Provisional_Specification_Updated.docx
@@ -182,12 +182,6 @@
         <w:gridCol w:w="7676"/>
       </w:tblGrid>
       <w:tr>
-        <w:tblPrEx>
-          <w:tblCellMar>
-            <w:top w:w="0" w:type="dxa"/>
-            <w:bottom w:w="0" w:type="dxa"/>
-          </w:tblCellMar>
-        </w:tblPrEx>
         <w:tc>
           <w:tcPr>
             <w:tcW w:w="1684" w:type="dxa"/>
@@ -362,12 +356,6 @@
         <w:gridCol w:w="7676"/>
       </w:tblGrid>
       <w:tr>
-        <w:tblPrEx>
-          <w:tblCellMar>
-            <w:top w:w="0" w:type="dxa"/>
-            <w:bottom w:w="0" w:type="dxa"/>
-          </w:tblCellMar>
-        </w:tblPrEx>
         <w:tc>
           <w:tcPr>
             <w:tcW w:w="1684" w:type="dxa"/>
@@ -430,7 +418,21 @@
                 <w:sz w:val="24"/>
                 <w:szCs w:val="24"/>
               </w:rPr>
-              <w:t>Venmugilrajan R.</w:t>
+              <w:t>Venmugil R</w:t>
+            </w:r>
+            <w:r>
+              <w:rPr>
+                <w:sz w:val="24"/>
+                <w:szCs w:val="24"/>
+              </w:rPr>
+              <w:t>ajan S</w:t>
+            </w:r>
+            <w:r>
+              <w:rPr>
+                <w:sz w:val="24"/>
+                <w:szCs w:val="24"/>
+              </w:rPr>
+              <w:t>.</w:t>
             </w:r>
           </w:p>
           <w:p>
@@ -509,7 +511,21 @@
                 <w:sz w:val="24"/>
                 <w:szCs w:val="24"/>
               </w:rPr>
-              <w:t>venmugilrajanr.cs24@bitsathy.ac.in</w:t>
+              <w:t>venmugilrajanr</w:t>
+            </w:r>
+            <w:r>
+              <w:rPr>
+                <w:sz w:val="24"/>
+                <w:szCs w:val="24"/>
+              </w:rPr>
+              <w:t>ajans</w:t>
+            </w:r>
+            <w:r>
+              <w:rPr>
+                <w:sz w:val="24"/>
+                <w:szCs w:val="24"/>
+              </w:rPr>
+              <w:t>.cs24@bitsathy.ac.in</w:t>
             </w:r>
           </w:p>
         </w:tc>
@@ -542,12 +558,6 @@
         <w:gridCol w:w="7676"/>
       </w:tblGrid>
       <w:tr>
-        <w:tblPrEx>
-          <w:tblCellMar>
-            <w:top w:w="0" w:type="dxa"/>
-            <w:bottom w:w="0" w:type="dxa"/>
-          </w:tblCellMar>
-        </w:tblPrEx>
         <w:tc>
           <w:tcPr>
             <w:tcW w:w="1684" w:type="dxa"/>
@@ -722,12 +732,6 @@
         <w:gridCol w:w="7676"/>
       </w:tblGrid>
       <w:tr>
-        <w:tblPrEx>
-          <w:tblCellMar>
-            <w:top w:w="0" w:type="dxa"/>
-            <w:bottom w:w="0" w:type="dxa"/>
-          </w:tblCellMar>
-        </w:tblPrEx>
         <w:tc>
           <w:tcPr>
             <w:tcW w:w="1684" w:type="dxa"/>
@@ -2291,7 +2295,21 @@
           <w:sz w:val="24"/>
           <w:szCs w:val="24"/>
         </w:rPr>
-        <w:t>2. (Venmugilrajan R.)</w:t>
+        <w:t>2. (Venmugil R</w:t>
+      </w:r>
+      <w:r>
+        <w:rPr>
+          <w:sz w:val="24"/>
+          <w:szCs w:val="24"/>
+        </w:rPr>
+        <w:t>ajan S</w:t>
+      </w:r>
+      <w:r>
+        <w:rPr>
+          <w:sz w:val="24"/>
+          <w:szCs w:val="24"/>
+        </w:rPr>
+        <w:t>)</w:t>
       </w:r>
     </w:p>
     <w:p>
@@ -3498,7 +3516,13 @@
         <w:rPr>
           <w:sz w:val="22"/>
         </w:rPr>
-        <w:t>2. (Venmugil</w:t>
+        <w:t>2. (</w:t>
+      </w:r>
+      <w:r>
+        <w:rPr>
+          <w:sz w:val="22"/>
+        </w:rPr>
+        <w:t>Venmugil</w:t>
       </w:r>
       <w:r>
         <w:rPr>

</xml_diff>